<commit_message>
update: cover letter with effect size comparison and divestment timing
- Added between-agent effect size comparison finding (P=0.043)
- Added new paragraph on anticipatory depreciation and divestment timing
- Updated EJA suitability points: actionable divestment guidance +
  generalisable framework for future regulations

Co-Authored-By: Tatsuki Onishi <bougtoir@gmail.com>
</commit_message>
<xml_diff>
--- a/vaporizer-price-study/papers/eja_cover_letter.docx
+++ b/vaporizer-price-study/papers/eja_cover_letter.docx
@@ -120,7 +120,7 @@
           <w:i w:val="0"/>
           <w:sz w:val="22"/>
         </w:rPr>
-        <w:t>In this study, we analysed 1,033 completed eBay sales of anaesthetic vaporisers (desflurane, sevoflurane and isoflurane) over three years, spanning the full legislative trajectory from the EC proposal through to post-ban implementation. Using complementary statistical approaches (Spearman rank correlation, Kendall τ trend test, Mann–Whitney U), we provide the first empirical evidence that the EU desflurane regulation was associated with a progressive, agent-specific decline in secondary market vaporiser prices. Crucially, sevoflurane and isoflurane vaporiser prices remained stable, serving as natural controls and strengthening the causal inference.</w:t>
+        <w:t>In this study, we analysed 1,033 completed eBay sales of anaesthetic vaporisers (desflurane, sevoflurane and isoflurane) over three years, spanning the full legislative trajectory from the EC proposal through to post-ban implementation. Using complementary statistical approaches (Spearman rank correlation, Kendall τ trend test, Mann–Whitney U and between-agent effect size comparison), we provide the first empirical evidence that the EU desflurane regulation was associated with a progressive, agent-specific decline in secondary market vaporiser prices. The desflurane effect size was significantly larger than that of sevoflurane (P=0.043), and sevoflurane and isoflurane vaporiser prices remained stable throughout, serving as natural controls.</w:t>
       </w:r>
     </w:p>
     <w:p>
@@ -133,7 +133,20 @@
           <w:i w:val="0"/>
           <w:sz w:val="22"/>
         </w:rPr>
-        <w:t>We believe this work is particularly well suited for EJA because: (1) it directly addresses the consequences of European anaesthesia policy, specifically the EU F-gas Regulation which is of primary relevance to EJA’s readership; (2) it provides evidence-based guidance for healthcare facilities managing equipment transitions; and (3) it bridges anaesthesiology, environmental policy and health economics—an interdisciplinary perspective aligned with EJA’s scope.</w:t>
+        <w:t>Critically, a substantial proportion of the price depreciation occurred during the legislative process itself, before the ban took effect. This finding has direct practical implications: anaesthesia departments seeking to recover residual capital value from regulated equipment should consider divestment during the regulatory cycle rather than waiting for formal prohibition.</w:t>
+      </w:r>
+    </w:p>
+    <w:p>
+      <w:pPr>
+        <w:spacing w:after="160"/>
+      </w:pPr>
+      <w:r>
+        <w:rPr>
+          <w:b w:val="0"/>
+          <w:i w:val="0"/>
+          <w:sz w:val="22"/>
+        </w:rPr>
+        <w:t>We believe this work is particularly well suited for EJA because: (1) it directly addresses the consequences of European anaesthesia policy, specifically the EU F-gas Regulation which is of primary relevance to EJA’s readership; (2) it provides actionable guidance on the timing of equipment divestment for anaesthesia departments; and (3) it offers a generalisable framework for anticipating equipment depreciation under future environmental regulations (e.g. nitrous oxide).</w:t>
       </w:r>
     </w:p>
     <w:p>

</xml_diff>

<commit_message>
refactor: reframe take-home message toward regulatory appeal
Discussion/Conclusion/Abstract reframed:
- 'Early compliance with well-signalled, evidence-based regulation yields
  better economic outcomes' (appeals to regulators/policymakers)
- Added patient benefit chain: cost recovery -> reinvestment in alternative
  equipment -> broader anaesthetic choice -> patient care
- Maintained all clinical/departmental implications
- Policy perspective added: anticipatory market decline as evidence regulation
  was credible, rational, and well signalled

Cover letter updated with matching framing (4-point EJA fit rationale).

No changes to data, statistics, tables, figures, or reference numbering.
Abstract 291/300, Body 2461/3500, Refs 1-18 Vancouver PASS.

Co-Authored-By: Tatsuki Onishi <bougtoir@gmail.com>
</commit_message>
<xml_diff>
--- a/vaporizer-price-study/papers/eja_cover_letter.docx
+++ b/vaporizer-price-study/papers/eja_cover_letter.docx
@@ -133,7 +133,7 @@
           <w:i w:val="0"/>
           <w:sz w:val="22"/>
         </w:rPr>
-        <w:t>Critically, a substantial proportion of the price depreciation occurred during the legislative process itself, before the ban took effect. This finding has direct practical implications: anaesthesia departments seeking to recover residual capital value from regulated equipment should consider divestment during the regulatory cycle rather than waiting for formal prohibition.</w:t>
+        <w:t>Critically, a substantial proportion of the price depreciation occurred during the legislative process itself, before the ban took effect. This anticipatory market response suggests that the regulation was perceived as credible and well signalled, generating predictable economic consequences. Our data indicate that early compliance during the legislative phase—rather than delayed action at the point of prohibition—was associated with better cost recovery, freeing capital for reinvestment in alternative equipment and thereby supporting broader anaesthetic choice and patient care.</w:t>
       </w:r>
     </w:p>
     <w:p>
@@ -146,7 +146,7 @@
           <w:i w:val="0"/>
           <w:sz w:val="22"/>
         </w:rPr>
-        <w:t>We believe this work is particularly well suited for EJA because: (1) it directly addresses the consequences of European anaesthesia policy, specifically the EU F-gas Regulation which is of primary relevance to EJA’s readership; (2) it provides actionable guidance on the timing of equipment divestment for anaesthesia departments; and (3) it offers a generalisable framework for anticipating equipment depreciation under future environmental regulations (e.g. nitrous oxide).</w:t>
+        <w:t>We believe this work is particularly well suited for EJA because: (1) it directly addresses the consequences of European anaesthesia policy, specifically the EU F-gas Regulation which is of primary relevance to EJA’s readership; (2) it provides empirical evidence that well-designed environmental regulation produces predictable, measurable economic outcomes—a finding of interest to both clinicians and policymakers; (3) it demonstrates that early compliance yields economic advantages that can support equipment reinvestment and patient care; and (4) it offers a generalisable framework for anticipating equipment depreciation under future environmental regulations (e.g. nitrous oxide).</w:t>
       </w:r>
     </w:p>
     <w:p>

</xml_diff>

<commit_message>
refactor: reframe vaporizer study — 'no collateral damage' as central message
Title: Targeted environmental regulation without collateral market damage
- Introduction: universal problem (regulation increasing) → natural experiment framing
- Abstract Background/Conclusions: collateral damage question as entry/exit
- Discussion: lead with no-collateral-damage finding, early compliance as secondary
- Conclusion: forward-looking (future bans need not be feared)
- Key Points: KP2 = no collateral damage, KP5 = reassuring precedent
- Cover letter: EJAIC-targeted, ESAIC advocacy validated framing
- References: reordered for new Vancouver appearance order (19 refs)
- Added Table 1, Table 2 Panel A, Table S1 in-text references in Results

Co-Authored-By: Tatsuki Onishi <bougtoir@gmail.com>
</commit_message>
<xml_diff>
--- a/vaporizer-price-study/papers/eja_cover_letter.docx
+++ b/vaporizer-price-study/papers/eja_cover_letter.docx
@@ -38,7 +38,7 @@
           <w:i/>
           <w:sz w:val="22"/>
         </w:rPr>
-        <w:t>European Journal of Anaesthesiology</w:t>
+        <w:t>European Journal of Anaesthesiology &amp; Intensive Care</w:t>
       </w:r>
     </w:p>
     <w:p>
@@ -68,7 +68,7 @@
         <w:rPr>
           <w:sz w:val="22"/>
         </w:rPr>
-        <w:t>Submission of original article – “Economic consequences of the European Union desflurane ban for anaesthetic equipment: a cross-sectional time-series analysis of secondary market vaporiser prices”</w:t>
+        <w:t>Submission of original article – “Targeted environmental regulation without collateral market damage: the EU desflurane ban and secondary market vaporiser prices”</w:t>
       </w:r>
     </w:p>
     <w:p>
@@ -94,7 +94,7 @@
           <w:i w:val="0"/>
           <w:sz w:val="22"/>
         </w:rPr>
-        <w:t>We are pleased to submit the above manuscript for consideration for publication in the European Journal of Anaesthesiology as an original article.</w:t>
+        <w:t>We are pleased to submit the above manuscript for consideration for publication in the European Journal of Anaesthesiology &amp; Intensive Care as an original article.</w:t>
       </w:r>
     </w:p>
     <w:p>
@@ -107,7 +107,7 @@
           <w:i w:val="0"/>
           <w:sz w:val="22"/>
         </w:rPr>
-        <w:t>The European Union’s prohibition of desflurane for routine anaesthesia (Regulation (EU) 2024/573), effective 1 January 2026, represents the first mandatory governmental restriction on a specific anaesthetic agent based on environmental grounds. While the clinical and environmental rationale for this regulation has been extensively debated, the downstream economic consequences for existing equipment remain unexplored.</w:t>
+        <w:t>Environmental regulations targeting specific anaesthetic agents are increasing — the EU desflurane ban, ASA recommendations on nitrous oxide deactivation, and NHS decommissioning programmes are recent examples. A common concern is that restricting a single agent could destabilise the broader equipment market. Yet whether such targeted regulation actually produces collateral economic effects on non-regulated equipment has never been empirically examined.</w:t>
       </w:r>
     </w:p>
     <w:p>
@@ -120,7 +120,7 @@
           <w:i w:val="0"/>
           <w:sz w:val="22"/>
         </w:rPr>
-        <w:t>In this study, we analysed 1,033 completed eBay sales of anaesthetic vaporisers (desflurane, sevoflurane and isoflurane) over three years, spanning the full legislative trajectory from the EC proposal through to post-ban implementation. Using complementary statistical approaches (Spearman rank correlation, Kendall τ trend test, Mann–Whitney U and between-agent effect size comparison), we provide the first empirical evidence that the EU desflurane regulation was associated with a progressive, agent-specific decline in secondary market vaporiser prices. The desflurane effect size was significantly larger than that of sevoflurane (P=0.043), and sevoflurane and isoflurane vaporiser prices remained stable throughout, serving as natural controls.</w:t>
+        <w:t>In this study, we analysed 1,033 completed eBay sales of anaesthetic vaporisers (desflurane, sevoflurane and isoflurane) over three years, spanning the full legislative trajectory from the EC proposal through to post-ban implementation. Using complementary statistical approaches (Spearman rank correlation, Kendall τ trend test, Mann–Whitney U and between-agent effect size comparison), we demonstrate that the EU desflurane ban achieved targeted economic effects: desflurane vaporiser prices declined progressively (P&lt;0.001), while sevoflurane and isoflurane vaporiser prices remained completely stable. The between-agent effect size comparison confirmed this specificity (P=0.043), and the two non-regulated agents were indistinguishable from each other (P=0.17).</w:t>
       </w:r>
     </w:p>
     <w:p>
@@ -133,7 +133,7 @@
           <w:i w:val="0"/>
           <w:sz w:val="22"/>
         </w:rPr>
-        <w:t>Critically, a substantial proportion of the price depreciation occurred during the legislative process itself, before the ban took effect. This anticipatory market response suggests that the regulation was perceived as credible and well signalled, generating predictable economic consequences. Our data indicate that early compliance during the legislative phase—rather than delayed action at the point of prohibition—was associated with better cost recovery, freeing capital for reinvestment in alternative equipment and thereby supporting broader anaesthetic choice and patient care.</w:t>
+        <w:t>The central message is reassuring: the regulation operated surgically, affecting only its intended target without collateral damage to the wider anaesthetic equipment market. Additionally, the price decline began during the legislative process itself, suggesting that well-signalled regulation generates predictable and orderly market adjustments. Early compliance was associated with better cost recovery, potentially freeing capital for reinvestment in alternative equipment.</w:t>
       </w:r>
     </w:p>
     <w:p>
@@ -146,7 +146,7 @@
           <w:i w:val="0"/>
           <w:sz w:val="22"/>
         </w:rPr>
-        <w:t>We believe this work is particularly well suited for EJA because: (1) it directly addresses the consequences of European anaesthesia policy, specifically the EU F-gas Regulation which is of primary relevance to EJA’s readership; (2) it provides empirical evidence that well-designed environmental regulation produces predictable, measurable economic outcomes—a finding of interest to both clinicians and policymakers; (3) it demonstrates that early compliance yields economic advantages that can support equipment reinvestment and patient care; and (4) it offers a generalisable framework for anticipating equipment depreciation under future environmental regulations (e.g. nitrous oxide).</w:t>
+        <w:t>We believe this work is particularly well suited for EJAIC because: (1) it provides empirical evidence that ESAIC’s advocacy for the desflurane ban produced precisely the targeted outcome intended—without destabilising the wider market; (2) as further environmental restrictions are anticipated (e.g. nitrous oxide), these findings offer a reassuring precedent for the European anaesthesia community; (3) the actionable implications for equipment management during regulatory transitions are directly relevant to EJAIC’s clinical readership; and (4) the natural experiment design, with non-regulated agents as controls, provides a rigorous methodological framework applicable to future regulatory impact assessments.</w:t>
       </w:r>
     </w:p>
     <w:p>

</xml_diff>